<commit_message>
Añadiendo Diagrama de Gantt
</commit_message>
<xml_diff>
--- a/Planificación/Planificacion ForoMultitema.docx
+++ b/Planificación/Planificacion ForoMultitema.docx
@@ -122,9 +122,1268 @@
         </w:rPr>
       </w:pPr>
     </w:p>
+    <w:p>
+      <w:pPr>
+        <w:rPr>
+          <w:lang w:val="es-ES"/>
+        </w:rPr>
+      </w:pPr>
+    </w:p>
+    <w:p>
+      <w:pPr>
+        <w:rPr>
+          <w:lang w:val="es-ES"/>
+        </w:rPr>
+      </w:pPr>
+    </w:p>
+    <w:p>
+      <w:pPr>
+        <w:rPr>
+          <w:lang w:val="es-ES"/>
+        </w:rPr>
+      </w:pPr>
+    </w:p>
+    <w:p>
+      <w:pPr>
+        <w:rPr>
+          <w:lang w:val="es-ES"/>
+        </w:rPr>
+      </w:pPr>
+    </w:p>
+    <w:p>
+      <w:pPr>
+        <w:rPr>
+          <w:lang w:val="es-ES"/>
+        </w:rPr>
+      </w:pPr>
+    </w:p>
+    <w:p>
+      <w:pPr>
+        <w:rPr>
+          <w:lang w:val="es-ES"/>
+        </w:rPr>
+      </w:pPr>
+    </w:p>
+    <w:p>
+      <w:pPr>
+        <w:rPr>
+          <w:lang w:val="es-ES"/>
+        </w:rPr>
+      </w:pPr>
+    </w:p>
+    <w:p>
+      <w:pPr>
+        <w:rPr>
+          <w:lang w:val="es-ES"/>
+        </w:rPr>
+      </w:pPr>
+    </w:p>
+    <w:p>
+      <w:pPr>
+        <w:rPr>
+          <w:lang w:val="es-ES"/>
+        </w:rPr>
+      </w:pPr>
+    </w:p>
+    <w:p>
+      <w:pPr>
+        <w:rPr>
+          <w:lang w:val="es-ES"/>
+        </w:rPr>
+      </w:pPr>
+    </w:p>
+    <w:p>
+      <w:pPr>
+        <w:rPr>
+          <w:lang w:val="es-ES"/>
+        </w:rPr>
+      </w:pPr>
+    </w:p>
+    <w:p>
+      <w:pPr>
+        <w:rPr>
+          <w:lang w:val="es-ES"/>
+        </w:rPr>
+      </w:pPr>
+    </w:p>
+    <w:p>
+      <w:pPr>
+        <w:rPr>
+          <w:lang w:val="es-ES"/>
+        </w:rPr>
+      </w:pPr>
+    </w:p>
+    <w:p>
+      <w:pPr>
+        <w:rPr>
+          <w:lang w:val="es-ES"/>
+        </w:rPr>
+      </w:pPr>
+    </w:p>
+    <w:p>
+      <w:pPr>
+        <w:rPr>
+          <w:lang w:val="es-ES"/>
+        </w:rPr>
+      </w:pPr>
+    </w:p>
+    <w:p>
+      <w:pPr>
+        <w:rPr>
+          <w:lang w:val="es-ES"/>
+        </w:rPr>
+      </w:pPr>
+    </w:p>
+    <w:p>
+      <w:pPr>
+        <w:rPr>
+          <w:lang w:val="es-ES"/>
+        </w:rPr>
+      </w:pPr>
+    </w:p>
+    <w:p>
+      <w:pPr>
+        <w:rPr>
+          <w:lang w:val="es-ES"/>
+        </w:rPr>
+      </w:pPr>
+    </w:p>
+    <w:p>
+      <w:pPr>
+        <w:rPr>
+          <w:lang w:val="es-ES"/>
+        </w:rPr>
+      </w:pPr>
+    </w:p>
+    <w:p>
+      <w:pPr>
+        <w:rPr>
+          <w:lang w:val="es-ES"/>
+        </w:rPr>
+      </w:pPr>
+    </w:p>
+    <w:p>
+      <w:pPr>
+        <w:rPr>
+          <w:lang w:val="es-ES"/>
+        </w:rPr>
+      </w:pPr>
+    </w:p>
+    <w:p>
+      <w:pPr>
+        <w:pStyle w:val="Ttulo"/>
+        <w:rPr>
+          <w:lang w:val="es-ES"/>
+        </w:rPr>
+      </w:pPr>
+      <w:r>
+        <w:rPr>
+          <w:lang w:val="es-ES"/>
+        </w:rPr>
+        <w:lastRenderedPageBreak/>
+        <w:t>1.</w:t>
+      </w:r>
+      <w:r>
+        <w:rPr>
+          <w:lang w:val="es-ES"/>
+        </w:rPr>
+        <w:tab/>
+        <w:t>Secuenciación de tareas y estimación de duraciones</w:t>
+      </w:r>
+    </w:p>
+    <w:p/>
+    <w:tbl>
+      <w:tblPr>
+        <w:tblStyle w:val="Sombreadoclaro-nfasis1"/>
+        <w:tblW w:w="0" w:type="auto"/>
+        <w:tblBorders>
+          <w:left w:val="single" w:sz="8" w:space="0" w:color="156082" w:themeColor="accent1"/>
+          <w:right w:val="single" w:sz="8" w:space="0" w:color="156082" w:themeColor="accent1"/>
+          <w:insideH w:val="single" w:sz="8" w:space="0" w:color="156082" w:themeColor="accent1"/>
+          <w:insideV w:val="single" w:sz="8" w:space="0" w:color="156082" w:themeColor="accent1"/>
+        </w:tblBorders>
+        <w:tblLook w:val="0660" w:firstRow="1" w:lastRow="1" w:firstColumn="0" w:lastColumn="0" w:noHBand="1" w:noVBand="1"/>
+      </w:tblPr>
+      <w:tblGrid>
+        <w:gridCol w:w="5093"/>
+        <w:gridCol w:w="1286"/>
+        <w:gridCol w:w="2981"/>
+      </w:tblGrid>
+      <w:tr>
+        <w:trPr>
+          <w:cnfStyle w:val="100000000000" w:firstRow="1" w:lastRow="0" w:firstColumn="0" w:lastColumn="0" w:oddVBand="0" w:evenVBand="0" w:oddHBand="0" w:evenHBand="0" w:firstRowFirstColumn="0" w:firstRowLastColumn="0" w:lastRowFirstColumn="0" w:lastRowLastColumn="0"/>
+          <w:trHeight w:val="552"/>
+        </w:trPr>
+        <w:tc>
+          <w:tcPr>
+            <w:tcW w:w="5093" w:type="dxa"/>
+            <w:noWrap/>
+          </w:tcPr>
+          <w:p>
+            <w:proofErr w:type="spellStart"/>
+            <w:r>
+              <w:rPr>
+                <w:lang w:val="en-US"/>
+              </w:rPr>
+              <w:t>Actividad</w:t>
+            </w:r>
+            <w:proofErr w:type="spellEnd"/>
+          </w:p>
+        </w:tc>
+        <w:tc>
+          <w:tcPr>
+            <w:tcW w:w="1286" w:type="dxa"/>
+          </w:tcPr>
+          <w:p>
+            <w:proofErr w:type="spellStart"/>
+            <w:r>
+              <w:rPr>
+                <w:lang w:val="en-US"/>
+              </w:rPr>
+              <w:t>Duración</w:t>
+            </w:r>
+            <w:proofErr w:type="spellEnd"/>
+            <w:r>
+              <w:rPr>
+                <w:lang w:val="en-US"/>
+              </w:rPr>
+              <w:t xml:space="preserve"> </w:t>
+            </w:r>
+            <w:proofErr w:type="spellStart"/>
+            <w:r>
+              <w:rPr>
+                <w:lang w:val="en-US"/>
+              </w:rPr>
+              <w:t>estimada</w:t>
+            </w:r>
+            <w:proofErr w:type="spellEnd"/>
+          </w:p>
+        </w:tc>
+        <w:tc>
+          <w:tcPr>
+            <w:tcW w:w="2981" w:type="dxa"/>
+          </w:tcPr>
+          <w:p>
+            <w:proofErr w:type="spellStart"/>
+            <w:r>
+              <w:rPr>
+                <w:lang w:val="en-US"/>
+              </w:rPr>
+              <w:t>Precedencia</w:t>
+            </w:r>
+            <w:proofErr w:type="spellEnd"/>
+          </w:p>
+        </w:tc>
+      </w:tr>
+      <w:tr>
+        <w:trPr>
+          <w:trHeight w:val="526"/>
+        </w:trPr>
+        <w:tc>
+          <w:tcPr>
+            <w:tcW w:w="5093" w:type="dxa"/>
+            <w:noWrap/>
+          </w:tcPr>
+          <w:p>
+            <w:proofErr w:type="spellStart"/>
+            <w:r>
+              <w:rPr>
+                <w:lang w:val="en-US"/>
+              </w:rPr>
+              <w:t>Configuración</w:t>
+            </w:r>
+            <w:proofErr w:type="spellEnd"/>
+            <w:r>
+              <w:rPr>
+                <w:lang w:val="en-US"/>
+              </w:rPr>
+              <w:t xml:space="preserve"> del </w:t>
+            </w:r>
+            <w:proofErr w:type="spellStart"/>
+            <w:r>
+              <w:rPr>
+                <w:lang w:val="en-US"/>
+              </w:rPr>
+              <w:t>entorno</w:t>
+            </w:r>
+            <w:proofErr w:type="spellEnd"/>
+            <w:r>
+              <w:rPr>
+                <w:lang w:val="en-US"/>
+              </w:rPr>
+              <w:t xml:space="preserve"> (Laravel, XAMPP, GitHub)</w:t>
+            </w:r>
+          </w:p>
+        </w:tc>
+        <w:tc>
+          <w:tcPr>
+            <w:tcW w:w="1286" w:type="dxa"/>
+          </w:tcPr>
+          <w:p>
+            <w:pPr>
+              <w:pStyle w:val="DecimalAligned"/>
+            </w:pPr>
+            <w:r>
+              <w:t xml:space="preserve">2 </w:t>
+            </w:r>
+            <w:proofErr w:type="gramStart"/>
+            <w:r>
+              <w:t>Días</w:t>
+            </w:r>
+            <w:proofErr w:type="gramEnd"/>
+          </w:p>
+        </w:tc>
+        <w:tc>
+          <w:tcPr>
+            <w:tcW w:w="2981" w:type="dxa"/>
+          </w:tcPr>
+          <w:p>
+            <w:pPr>
+              <w:pStyle w:val="DecimalAligned"/>
+            </w:pPr>
+            <w:r>
+              <w:t>Inicio</w:t>
+            </w:r>
+          </w:p>
+        </w:tc>
+      </w:tr>
+      <w:tr>
+        <w:trPr>
+          <w:trHeight w:val="855"/>
+        </w:trPr>
+        <w:tc>
+          <w:tcPr>
+            <w:tcW w:w="5093" w:type="dxa"/>
+            <w:noWrap/>
+          </w:tcPr>
+          <w:p>
+            <w:proofErr w:type="spellStart"/>
+            <w:r>
+              <w:rPr>
+                <w:lang w:val="en-US"/>
+              </w:rPr>
+              <w:t>Diseño</w:t>
+            </w:r>
+            <w:proofErr w:type="spellEnd"/>
+            <w:r>
+              <w:rPr>
+                <w:lang w:val="en-US"/>
+              </w:rPr>
+              <w:t xml:space="preserve"> de la base de </w:t>
+            </w:r>
+            <w:proofErr w:type="spellStart"/>
+            <w:r>
+              <w:rPr>
+                <w:lang w:val="en-US"/>
+              </w:rPr>
+              <w:t>datos</w:t>
+            </w:r>
+            <w:proofErr w:type="spellEnd"/>
+            <w:r>
+              <w:rPr>
+                <w:lang w:val="en-US"/>
+              </w:rPr>
+              <w:t xml:space="preserve"> MySQL y </w:t>
+            </w:r>
+            <w:proofErr w:type="spellStart"/>
+            <w:r>
+              <w:rPr>
+                <w:lang w:val="en-US"/>
+              </w:rPr>
+              <w:t>migraciones</w:t>
+            </w:r>
+            <w:proofErr w:type="spellEnd"/>
+          </w:p>
+        </w:tc>
+        <w:tc>
+          <w:tcPr>
+            <w:tcW w:w="1286" w:type="dxa"/>
+          </w:tcPr>
+          <w:p>
+            <w:pPr>
+              <w:pStyle w:val="DecimalAligned"/>
+            </w:pPr>
+            <w:r>
+              <w:t xml:space="preserve">3 </w:t>
+            </w:r>
+            <w:proofErr w:type="gramStart"/>
+            <w:r>
+              <w:t>Días</w:t>
+            </w:r>
+            <w:proofErr w:type="gramEnd"/>
+          </w:p>
+        </w:tc>
+        <w:tc>
+          <w:tcPr>
+            <w:tcW w:w="2981" w:type="dxa"/>
+          </w:tcPr>
+          <w:p>
+            <w:pPr>
+              <w:pStyle w:val="DecimalAligned"/>
+            </w:pPr>
+            <w:r>
+              <w:t>Tras Configuración</w:t>
+            </w:r>
+          </w:p>
+        </w:tc>
+      </w:tr>
+      <w:tr>
+        <w:trPr>
+          <w:trHeight w:val="526"/>
+        </w:trPr>
+        <w:tc>
+          <w:tcPr>
+            <w:tcW w:w="5093" w:type="dxa"/>
+            <w:noWrap/>
+          </w:tcPr>
+          <w:p>
+            <w:r>
+              <w:rPr>
+                <w:lang w:val="en-US"/>
+              </w:rPr>
+              <w:t xml:space="preserve">Desarrollo del backend con Laravel (auth, </w:t>
+            </w:r>
+            <w:proofErr w:type="spellStart"/>
+            <w:r>
+              <w:rPr>
+                <w:lang w:val="en-US"/>
+              </w:rPr>
+              <w:t>controladores</w:t>
+            </w:r>
+            <w:proofErr w:type="spellEnd"/>
+            <w:r>
+              <w:rPr>
+                <w:lang w:val="en-US"/>
+              </w:rPr>
+              <w:t xml:space="preserve">, </w:t>
+            </w:r>
+            <w:proofErr w:type="spellStart"/>
+            <w:r>
+              <w:rPr>
+                <w:lang w:val="en-US"/>
+              </w:rPr>
+              <w:t>rutas</w:t>
+            </w:r>
+            <w:proofErr w:type="spellEnd"/>
+            <w:r>
+              <w:rPr>
+                <w:lang w:val="en-US"/>
+              </w:rPr>
+              <w:t>)</w:t>
+            </w:r>
+          </w:p>
+        </w:tc>
+        <w:tc>
+          <w:tcPr>
+            <w:tcW w:w="1286" w:type="dxa"/>
+          </w:tcPr>
+          <w:p>
+            <w:pPr>
+              <w:pStyle w:val="DecimalAligned"/>
+            </w:pPr>
+            <w:r>
+              <w:t xml:space="preserve">15 </w:t>
+            </w:r>
+            <w:proofErr w:type="gramStart"/>
+            <w:r>
+              <w:t>Días</w:t>
+            </w:r>
+            <w:proofErr w:type="gramEnd"/>
+          </w:p>
+        </w:tc>
+        <w:tc>
+          <w:tcPr>
+            <w:tcW w:w="2981" w:type="dxa"/>
+          </w:tcPr>
+          <w:p>
+            <w:pPr>
+              <w:pStyle w:val="DecimalAligned"/>
+            </w:pPr>
+            <w:r>
+              <w:t>Tras Diseño BD</w:t>
+            </w:r>
+          </w:p>
+        </w:tc>
+      </w:tr>
+      <w:tr>
+        <w:trPr>
+          <w:trHeight w:val="526"/>
+        </w:trPr>
+        <w:tc>
+          <w:tcPr>
+            <w:tcW w:w="5093" w:type="dxa"/>
+            <w:noWrap/>
+          </w:tcPr>
+          <w:p>
+            <w:proofErr w:type="spellStart"/>
+            <w:r>
+              <w:rPr>
+                <w:lang w:val="en-US"/>
+              </w:rPr>
+              <w:t>Maquetación</w:t>
+            </w:r>
+            <w:proofErr w:type="spellEnd"/>
+            <w:r>
+              <w:rPr>
+                <w:lang w:val="en-US"/>
+              </w:rPr>
+              <w:t xml:space="preserve"> frontend con Bootstrap y</w:t>
+            </w:r>
+            <w:r>
+              <w:rPr>
+                <w:lang w:val="en-US"/>
+              </w:rPr>
+              <w:t xml:space="preserve"> </w:t>
+            </w:r>
+            <w:proofErr w:type="spellStart"/>
+            <w:r>
+              <w:rPr>
+                <w:lang w:val="en-US"/>
+              </w:rPr>
+              <w:t>usando</w:t>
+            </w:r>
+            <w:proofErr w:type="spellEnd"/>
+            <w:r>
+              <w:rPr>
+                <w:lang w:val="en-US"/>
+              </w:rPr>
+              <w:t xml:space="preserve"> las vistas de Laravel</w:t>
+            </w:r>
+          </w:p>
+        </w:tc>
+        <w:tc>
+          <w:tcPr>
+            <w:tcW w:w="1286" w:type="dxa"/>
+          </w:tcPr>
+          <w:p>
+            <w:pPr>
+              <w:pStyle w:val="DecimalAligned"/>
+            </w:pPr>
+            <w:r>
+              <w:t xml:space="preserve">8 </w:t>
+            </w:r>
+            <w:proofErr w:type="gramStart"/>
+            <w:r>
+              <w:t>Días</w:t>
+            </w:r>
+            <w:proofErr w:type="gramEnd"/>
+          </w:p>
+        </w:tc>
+        <w:tc>
+          <w:tcPr>
+            <w:tcW w:w="2981" w:type="dxa"/>
+          </w:tcPr>
+          <w:p>
+            <w:pPr>
+              <w:pStyle w:val="DecimalAligned"/>
+            </w:pPr>
+            <w:r>
+              <w:t xml:space="preserve">Puede realizarse Junto al </w:t>
+            </w:r>
+            <w:proofErr w:type="spellStart"/>
+            <w:r>
+              <w:t>backend</w:t>
+            </w:r>
+            <w:proofErr w:type="spellEnd"/>
+          </w:p>
+        </w:tc>
+      </w:tr>
+      <w:tr>
+        <w:trPr>
+          <w:trHeight w:val="540"/>
+        </w:trPr>
+        <w:tc>
+          <w:tcPr>
+            <w:tcW w:w="5093" w:type="dxa"/>
+            <w:noWrap/>
+          </w:tcPr>
+          <w:p>
+            <w:proofErr w:type="spellStart"/>
+            <w:r>
+              <w:rPr>
+                <w:lang w:val="en-US"/>
+              </w:rPr>
+              <w:t>Implementación</w:t>
+            </w:r>
+            <w:proofErr w:type="spellEnd"/>
+            <w:r>
+              <w:rPr>
+                <w:lang w:val="en-US"/>
+              </w:rPr>
+              <w:t xml:space="preserve"> de </w:t>
+            </w:r>
+            <w:proofErr w:type="spellStart"/>
+            <w:r>
+              <w:rPr>
+                <w:lang w:val="en-US"/>
+              </w:rPr>
+              <w:t>funcionalidades</w:t>
+            </w:r>
+            <w:proofErr w:type="spellEnd"/>
+            <w:r>
+              <w:rPr>
+                <w:lang w:val="en-US"/>
+              </w:rPr>
+              <w:t xml:space="preserve"> (CRUD, </w:t>
+            </w:r>
+            <w:proofErr w:type="spellStart"/>
+            <w:r>
+              <w:rPr>
+                <w:lang w:val="en-US"/>
+              </w:rPr>
+              <w:t>categorías</w:t>
+            </w:r>
+            <w:proofErr w:type="spellEnd"/>
+            <w:r>
+              <w:rPr>
+                <w:lang w:val="en-US"/>
+              </w:rPr>
+              <w:t xml:space="preserve">, </w:t>
+            </w:r>
+            <w:proofErr w:type="spellStart"/>
+            <w:r>
+              <w:rPr>
+                <w:lang w:val="en-US"/>
+              </w:rPr>
+              <w:t>comentarios</w:t>
+            </w:r>
+            <w:proofErr w:type="spellEnd"/>
+            <w:r>
+              <w:rPr>
+                <w:lang w:val="en-US"/>
+              </w:rPr>
+              <w:t xml:space="preserve">, </w:t>
+            </w:r>
+            <w:proofErr w:type="spellStart"/>
+            <w:r>
+              <w:rPr>
+                <w:lang w:val="en-US"/>
+              </w:rPr>
+              <w:t>búsqueda</w:t>
+            </w:r>
+            <w:proofErr w:type="spellEnd"/>
+            <w:r>
+              <w:rPr>
+                <w:lang w:val="en-US"/>
+              </w:rPr>
+              <w:t>)</w:t>
+            </w:r>
+          </w:p>
+        </w:tc>
+        <w:tc>
+          <w:tcPr>
+            <w:tcW w:w="1286" w:type="dxa"/>
+          </w:tcPr>
+          <w:p>
+            <w:pPr>
+              <w:pStyle w:val="DecimalAligned"/>
+            </w:pPr>
+            <w:r>
+              <w:t xml:space="preserve">7 </w:t>
+            </w:r>
+            <w:proofErr w:type="gramStart"/>
+            <w:r>
+              <w:t>Días</w:t>
+            </w:r>
+            <w:proofErr w:type="gramEnd"/>
+          </w:p>
+        </w:tc>
+        <w:tc>
+          <w:tcPr>
+            <w:tcW w:w="2981" w:type="dxa"/>
+          </w:tcPr>
+          <w:p>
+            <w:pPr>
+              <w:pStyle w:val="DecimalAligned"/>
+            </w:pPr>
+            <w:r>
+              <w:t xml:space="preserve">Tras </w:t>
+            </w:r>
+            <w:proofErr w:type="spellStart"/>
+            <w:r>
+              <w:t>backend</w:t>
+            </w:r>
+            <w:proofErr w:type="spellEnd"/>
+            <w:r>
+              <w:t xml:space="preserve"> y </w:t>
+            </w:r>
+            <w:proofErr w:type="spellStart"/>
+            <w:r>
+              <w:t>frontend</w:t>
+            </w:r>
+            <w:proofErr w:type="spellEnd"/>
+            <w:r>
+              <w:t xml:space="preserve"> base</w:t>
+            </w:r>
+          </w:p>
+        </w:tc>
+      </w:tr>
+      <w:tr>
+        <w:trPr>
+          <w:trHeight w:val="526"/>
+        </w:trPr>
+        <w:tc>
+          <w:tcPr>
+            <w:tcW w:w="5093" w:type="dxa"/>
+            <w:noWrap/>
+          </w:tcPr>
+          <w:p>
+            <w:proofErr w:type="spellStart"/>
+            <w:r>
+              <w:rPr>
+                <w:lang w:val="en-US"/>
+              </w:rPr>
+              <w:t>Integración</w:t>
+            </w:r>
+            <w:proofErr w:type="spellEnd"/>
+            <w:r>
+              <w:rPr>
+                <w:lang w:val="en-US"/>
+              </w:rPr>
+              <w:t xml:space="preserve"> de JavaScript </w:t>
+            </w:r>
+            <w:r>
+              <w:rPr>
+                <w:lang w:val="en-US"/>
+              </w:rPr>
+              <w:t>(</w:t>
+            </w:r>
+            <w:proofErr w:type="spellStart"/>
+            <w:r>
+              <w:rPr>
+                <w:lang w:val="en-US"/>
+              </w:rPr>
+              <w:t>interactividad</w:t>
+            </w:r>
+            <w:proofErr w:type="spellEnd"/>
+            <w:r>
+              <w:rPr>
+                <w:lang w:val="en-US"/>
+              </w:rPr>
+              <w:t xml:space="preserve"> </w:t>
+            </w:r>
+            <w:proofErr w:type="spellStart"/>
+            <w:r>
+              <w:rPr>
+                <w:lang w:val="en-US"/>
+              </w:rPr>
+              <w:t>ej</w:t>
+            </w:r>
+            <w:proofErr w:type="spellEnd"/>
+            <w:r>
+              <w:rPr>
+                <w:lang w:val="en-US"/>
+              </w:rPr>
+              <w:t xml:space="preserve"> </w:t>
+            </w:r>
+            <w:proofErr w:type="spellStart"/>
+            <w:r>
+              <w:rPr>
+                <w:lang w:val="en-US"/>
+              </w:rPr>
+              <w:t>filtros</w:t>
+            </w:r>
+            <w:proofErr w:type="spellEnd"/>
+            <w:r>
+              <w:rPr>
+                <w:lang w:val="en-US"/>
+              </w:rPr>
+              <w:t xml:space="preserve"> de </w:t>
+            </w:r>
+            <w:proofErr w:type="spellStart"/>
+            <w:r>
+              <w:rPr>
+                <w:lang w:val="en-US"/>
+              </w:rPr>
+              <w:t>búsqueda</w:t>
+            </w:r>
+            <w:proofErr w:type="spellEnd"/>
+            <w:r>
+              <w:rPr>
+                <w:lang w:val="en-US"/>
+              </w:rPr>
+              <w:t>)</w:t>
+            </w:r>
+          </w:p>
+        </w:tc>
+        <w:tc>
+          <w:tcPr>
+            <w:tcW w:w="1286" w:type="dxa"/>
+          </w:tcPr>
+          <w:p>
+            <w:pPr>
+              <w:pStyle w:val="DecimalAligned"/>
+            </w:pPr>
+            <w:r>
+              <w:t xml:space="preserve">4 </w:t>
+            </w:r>
+            <w:proofErr w:type="gramStart"/>
+            <w:r>
+              <w:t>Días</w:t>
+            </w:r>
+            <w:proofErr w:type="gramEnd"/>
+          </w:p>
+        </w:tc>
+        <w:tc>
+          <w:tcPr>
+            <w:tcW w:w="2981" w:type="dxa"/>
+          </w:tcPr>
+          <w:p>
+            <w:pPr>
+              <w:pStyle w:val="DecimalAligned"/>
+            </w:pPr>
+            <w:r>
+              <w:rPr>
+                <w:lang w:val="en-US"/>
+              </w:rPr>
+              <w:t xml:space="preserve">Tras </w:t>
+            </w:r>
+            <w:proofErr w:type="spellStart"/>
+            <w:r>
+              <w:rPr>
+                <w:lang w:val="en-US"/>
+              </w:rPr>
+              <w:t>funcionalidades</w:t>
+            </w:r>
+            <w:proofErr w:type="spellEnd"/>
+          </w:p>
+        </w:tc>
+      </w:tr>
+      <w:tr>
+        <w:trPr>
+          <w:trHeight w:val="526"/>
+        </w:trPr>
+        <w:tc>
+          <w:tcPr>
+            <w:tcW w:w="5093" w:type="dxa"/>
+            <w:noWrap/>
+          </w:tcPr>
+          <w:p>
+            <w:proofErr w:type="spellStart"/>
+            <w:r>
+              <w:rPr>
+                <w:lang w:val="en-US"/>
+              </w:rPr>
+              <w:t>Pruebas</w:t>
+            </w:r>
+            <w:proofErr w:type="spellEnd"/>
+            <w:r>
+              <w:rPr>
+                <w:lang w:val="en-US"/>
+              </w:rPr>
+              <w:t xml:space="preserve"> </w:t>
+            </w:r>
+            <w:proofErr w:type="spellStart"/>
+            <w:r>
+              <w:rPr>
+                <w:lang w:val="en-US"/>
+              </w:rPr>
+              <w:t>funcionales</w:t>
+            </w:r>
+            <w:proofErr w:type="spellEnd"/>
+            <w:r>
+              <w:rPr>
+                <w:lang w:val="en-US"/>
+              </w:rPr>
+              <w:t xml:space="preserve"> y de </w:t>
+            </w:r>
+            <w:proofErr w:type="spellStart"/>
+            <w:r>
+              <w:rPr>
+                <w:lang w:val="en-US"/>
+              </w:rPr>
+              <w:t>usabilidad</w:t>
+            </w:r>
+            <w:proofErr w:type="spellEnd"/>
+          </w:p>
+        </w:tc>
+        <w:tc>
+          <w:tcPr>
+            <w:tcW w:w="1286" w:type="dxa"/>
+          </w:tcPr>
+          <w:p>
+            <w:pPr>
+              <w:pStyle w:val="DecimalAligned"/>
+            </w:pPr>
+            <w:r>
+              <w:t xml:space="preserve">4 </w:t>
+            </w:r>
+            <w:proofErr w:type="gramStart"/>
+            <w:r>
+              <w:t>Días</w:t>
+            </w:r>
+            <w:proofErr w:type="gramEnd"/>
+          </w:p>
+        </w:tc>
+        <w:tc>
+          <w:tcPr>
+            <w:tcW w:w="2981" w:type="dxa"/>
+          </w:tcPr>
+          <w:p>
+            <w:pPr>
+              <w:pStyle w:val="DecimalAligned"/>
+            </w:pPr>
+            <w:r>
+              <w:rPr>
+                <w:lang w:val="en-US"/>
+              </w:rPr>
+              <w:t xml:space="preserve">Tras </w:t>
+            </w:r>
+            <w:proofErr w:type="spellStart"/>
+            <w:r>
+              <w:rPr>
+                <w:lang w:val="en-US"/>
+              </w:rPr>
+              <w:t>integración</w:t>
+            </w:r>
+            <w:proofErr w:type="spellEnd"/>
+            <w:r>
+              <w:rPr>
+                <w:lang w:val="en-US"/>
+              </w:rPr>
+              <w:t xml:space="preserve"> JS</w:t>
+            </w:r>
+          </w:p>
+        </w:tc>
+      </w:tr>
+      <w:tr>
+        <w:trPr>
+          <w:trHeight w:val="526"/>
+        </w:trPr>
+        <w:tc>
+          <w:tcPr>
+            <w:tcW w:w="5093" w:type="dxa"/>
+            <w:tcBorders>
+              <w:bottom w:val="single" w:sz="4" w:space="0" w:color="auto"/>
+            </w:tcBorders>
+            <w:noWrap/>
+          </w:tcPr>
+          <w:p>
+            <w:proofErr w:type="spellStart"/>
+            <w:r>
+              <w:rPr>
+                <w:lang w:val="en-US"/>
+              </w:rPr>
+              <w:t>Despliegue</w:t>
+            </w:r>
+            <w:proofErr w:type="spellEnd"/>
+            <w:r>
+              <w:rPr>
+                <w:lang w:val="en-US"/>
+              </w:rPr>
+              <w:t xml:space="preserve"> </w:t>
+            </w:r>
+            <w:proofErr w:type="spellStart"/>
+            <w:r>
+              <w:rPr>
+                <w:lang w:val="en-US"/>
+              </w:rPr>
+              <w:t>en</w:t>
+            </w:r>
+            <w:proofErr w:type="spellEnd"/>
+            <w:r>
+              <w:rPr>
+                <w:lang w:val="en-US"/>
+              </w:rPr>
+              <w:t xml:space="preserve"> hosting/AWS</w:t>
+            </w:r>
+          </w:p>
+        </w:tc>
+        <w:tc>
+          <w:tcPr>
+            <w:tcW w:w="1286" w:type="dxa"/>
+          </w:tcPr>
+          <w:p>
+            <w:pPr>
+              <w:pStyle w:val="DecimalAligned"/>
+            </w:pPr>
+            <w:r>
+              <w:t>3</w:t>
+            </w:r>
+            <w:r>
+              <w:t xml:space="preserve"> </w:t>
+            </w:r>
+            <w:proofErr w:type="spellStart"/>
+            <w:r>
+              <w:t>Dias</w:t>
+            </w:r>
+            <w:proofErr w:type="spellEnd"/>
+          </w:p>
+        </w:tc>
+        <w:tc>
+          <w:tcPr>
+            <w:tcW w:w="2981" w:type="dxa"/>
+            <w:tcBorders>
+              <w:bottom w:val="single" w:sz="4" w:space="0" w:color="auto"/>
+            </w:tcBorders>
+          </w:tcPr>
+          <w:p>
+            <w:pPr>
+              <w:pStyle w:val="DecimalAligned"/>
+            </w:pPr>
+            <w:r>
+              <w:rPr>
+                <w:lang w:val="en-US"/>
+              </w:rPr>
+              <w:t xml:space="preserve">Tras </w:t>
+            </w:r>
+            <w:proofErr w:type="spellStart"/>
+            <w:r>
+              <w:rPr>
+                <w:lang w:val="en-US"/>
+              </w:rPr>
+              <w:t>pruebas</w:t>
+            </w:r>
+            <w:proofErr w:type="spellEnd"/>
+          </w:p>
+        </w:tc>
+      </w:tr>
+      <w:tr>
+        <w:trPr>
+          <w:cnfStyle w:val="010000000000" w:firstRow="0" w:lastRow="1" w:firstColumn="0" w:lastColumn="0" w:oddVBand="0" w:evenVBand="0" w:oddHBand="0" w:evenHBand="0" w:firstRowFirstColumn="0" w:firstRowLastColumn="0" w:lastRowFirstColumn="0" w:lastRowLastColumn="0"/>
+          <w:trHeight w:val="526"/>
+        </w:trPr>
+        <w:tc>
+          <w:tcPr>
+            <w:tcW w:w="5093" w:type="dxa"/>
+            <w:tcBorders>
+              <w:top w:val="single" w:sz="4" w:space="0" w:color="auto"/>
+              <w:left w:val="single" w:sz="4" w:space="0" w:color="auto"/>
+              <w:bottom w:val="single" w:sz="4" w:space="0" w:color="auto"/>
+              <w:right w:val="single" w:sz="4" w:space="0" w:color="auto"/>
+            </w:tcBorders>
+            <w:noWrap/>
+          </w:tcPr>
+          <w:p>
+            <w:proofErr w:type="spellStart"/>
+            <w:r>
+              <w:rPr>
+                <w:lang w:val="en-US"/>
+              </w:rPr>
+              <w:t>Documentación</w:t>
+            </w:r>
+            <w:proofErr w:type="spellEnd"/>
+            <w:r>
+              <w:rPr>
+                <w:lang w:val="en-US"/>
+              </w:rPr>
+              <w:t xml:space="preserve"> </w:t>
+            </w:r>
+            <w:proofErr w:type="spellStart"/>
+            <w:r>
+              <w:rPr>
+                <w:lang w:val="en-US"/>
+              </w:rPr>
+              <w:t>técnica</w:t>
+            </w:r>
+            <w:proofErr w:type="spellEnd"/>
+            <w:r>
+              <w:rPr>
+                <w:lang w:val="en-US"/>
+              </w:rPr>
+              <w:t xml:space="preserve"> y </w:t>
+            </w:r>
+            <w:proofErr w:type="spellStart"/>
+            <w:r>
+              <w:rPr>
+                <w:lang w:val="en-US"/>
+              </w:rPr>
+              <w:t>manuales</w:t>
+            </w:r>
+            <w:proofErr w:type="spellEnd"/>
+          </w:p>
+        </w:tc>
+        <w:tc>
+          <w:tcPr>
+            <w:tcW w:w="1286" w:type="dxa"/>
+            <w:tcBorders>
+              <w:left w:val="single" w:sz="4" w:space="0" w:color="auto"/>
+              <w:bottom w:val="single" w:sz="4" w:space="0" w:color="auto"/>
+              <w:right w:val="single" w:sz="4" w:space="0" w:color="auto"/>
+            </w:tcBorders>
+          </w:tcPr>
+          <w:p>
+            <w:pPr>
+              <w:pStyle w:val="DecimalAligned"/>
+            </w:pPr>
+            <w:r>
+              <w:t xml:space="preserve">3 </w:t>
+            </w:r>
+            <w:proofErr w:type="gramStart"/>
+            <w:r>
+              <w:t>Días</w:t>
+            </w:r>
+            <w:proofErr w:type="gramEnd"/>
+          </w:p>
+        </w:tc>
+        <w:tc>
+          <w:tcPr>
+            <w:tcW w:w="2981" w:type="dxa"/>
+            <w:tcBorders>
+              <w:top w:val="single" w:sz="4" w:space="0" w:color="auto"/>
+              <w:left w:val="single" w:sz="4" w:space="0" w:color="auto"/>
+              <w:bottom w:val="single" w:sz="4" w:space="0" w:color="auto"/>
+              <w:right w:val="single" w:sz="4" w:space="0" w:color="auto"/>
+            </w:tcBorders>
+          </w:tcPr>
+          <w:p>
+            <w:pPr>
+              <w:pStyle w:val="DecimalAligned"/>
+            </w:pPr>
+            <w:r>
+              <w:t>Final</w:t>
+            </w:r>
+          </w:p>
+        </w:tc>
+      </w:tr>
+    </w:tbl>
+    <w:p>
+      <w:pPr>
+        <w:pStyle w:val="Textonotapie"/>
+      </w:pPr>
+    </w:p>
+    <w:p>
+      <w:pPr>
+        <w:rPr>
+          <w:lang w:val="es-ES"/>
+        </w:rPr>
+      </w:pPr>
+    </w:p>
+    <w:p>
+      <w:pPr>
+        <w:rPr>
+          <w:lang w:val="es-ES"/>
+        </w:rPr>
+      </w:pPr>
+    </w:p>
+    <w:p>
+      <w:pPr>
+        <w:rPr>
+          <w:lang w:val="es-ES"/>
+        </w:rPr>
+      </w:pPr>
+    </w:p>
+    <w:p>
+      <w:pPr>
+        <w:rPr>
+          <w:lang w:val="es-ES"/>
+        </w:rPr>
+      </w:pPr>
+    </w:p>
+    <w:p>
+      <w:pPr>
+        <w:rPr>
+          <w:lang w:val="es-ES"/>
+        </w:rPr>
+      </w:pPr>
+    </w:p>
+    <w:p>
+      <w:pPr>
+        <w:rPr>
+          <w:lang w:val="es-ES"/>
+        </w:rPr>
+      </w:pPr>
+    </w:p>
+    <w:p>
+      <w:pPr>
+        <w:rPr>
+          <w:lang w:val="es-ES"/>
+        </w:rPr>
+      </w:pPr>
+    </w:p>
+    <w:p>
+      <w:pPr>
+        <w:rPr>
+          <w:lang w:val="es-ES"/>
+        </w:rPr>
+      </w:pPr>
+    </w:p>
+    <w:p>
+      <w:pPr>
+        <w:pStyle w:val="Ttulo"/>
+        <w:rPr>
+          <w:lang w:val="es-ES"/>
+        </w:rPr>
+      </w:pPr>
+      <w:r>
+        <w:rPr>
+          <w:lang w:val="es-ES"/>
+        </w:rPr>
+        <w:lastRenderedPageBreak/>
+        <w:t>2.</w:t>
+      </w:r>
+      <w:r>
+        <w:rPr>
+          <w:lang w:val="es-ES"/>
+        </w:rPr>
+        <w:tab/>
+        <w:t>Diagrama de Gantt</w:t>
+      </w:r>
+    </w:p>
+    <w:p>
+      <w:pPr>
+        <w:rPr>
+          <w:lang w:val="es-ES"/>
+        </w:rPr>
+      </w:pPr>
+    </w:p>
+    <w:p>
+      <w:pPr>
+        <w:rPr>
+          <w:lang w:val="es-ES"/>
+        </w:rPr>
+      </w:pPr>
+      <w:r>
+        <w:rPr>
+          <w:noProof/>
+          <w:lang w:val="es-ES"/>
+        </w:rPr>
+        <w:drawing>
+          <wp:inline distT="0" distB="0" distL="0" distR="0" wp14:anchorId="70422BB7" wp14:editId="73C87AB5">
+            <wp:extent cx="5943600" cy="3314700"/>
+            <wp:effectExtent l="0" t="0" r="0" b="0"/>
+            <wp:docPr id="2081558991" name="Imagen 2"/>
+            <wp:cNvGraphicFramePr>
+              <a:graphicFrameLocks xmlns:a="http://schemas.openxmlformats.org/drawingml/2006/main" noChangeAspect="1"/>
+            </wp:cNvGraphicFramePr>
+            <a:graphic xmlns:a="http://schemas.openxmlformats.org/drawingml/2006/main">
+              <a:graphicData uri="http://schemas.openxmlformats.org/drawingml/2006/picture">
+                <pic:pic xmlns:pic="http://schemas.openxmlformats.org/drawingml/2006/picture">
+                  <pic:nvPicPr>
+                    <pic:cNvPr id="2081558991" name="Imagen 2081558991"/>
+                    <pic:cNvPicPr/>
+                  </pic:nvPicPr>
+                  <pic:blipFill>
+                    <a:blip r:embed="rId8" cstate="print">
+                      <a:extLst>
+                        <a:ext uri="{28A0092B-C50C-407E-A947-70E740481C1C}">
+                          <a14:useLocalDpi xmlns:a14="http://schemas.microsoft.com/office/drawing/2010/main" val="0"/>
+                        </a:ext>
+                      </a:extLst>
+                    </a:blip>
+                    <a:stretch>
+                      <a:fillRect/>
+                    </a:stretch>
+                  </pic:blipFill>
+                  <pic:spPr>
+                    <a:xfrm>
+                      <a:off x="0" y="0"/>
+                      <a:ext cx="5943600" cy="3314700"/>
+                    </a:xfrm>
+                    <a:prstGeom prst="rect">
+                      <a:avLst/>
+                    </a:prstGeom>
+                  </pic:spPr>
+                </pic:pic>
+              </a:graphicData>
+            </a:graphic>
+          </wp:inline>
+        </w:drawing>
+      </w:r>
+    </w:p>
     <w:sectPr>
-      <w:headerReference w:type="default" r:id="rId8"/>
-      <w:footerReference w:type="default" r:id="rId9"/>
+      <w:headerReference w:type="default" r:id="rId9"/>
+      <w:footerReference w:type="default" r:id="rId10"/>
       <w:pgSz w:w="12240" w:h="15840"/>
       <w:pgMar w:top="1440" w:right="1440" w:bottom="1440" w:left="1440" w:header="720" w:footer="720" w:gutter="0"/>
       <w:cols w:space="720"/>
@@ -1374,6 +2633,174 @@
     <w:uiPriority w:val="99"/>
     <w:rsid w:val="00AE49D1"/>
   </w:style>
+  <w:style w:type="paragraph" w:customStyle="1" w:styleId="DecimalAligned">
+    <w:name w:val="Decimal Aligned"/>
+    <w:basedOn w:val="Normal"/>
+    <w:uiPriority w:val="40"/>
+    <w:qFormat/>
+    <w:rsid w:val="0058684D"/>
+    <w:pPr>
+      <w:tabs>
+        <w:tab w:val="decimal" w:pos="360"/>
+      </w:tabs>
+      <w:spacing w:after="200" w:line="276" w:lineRule="auto"/>
+    </w:pPr>
+    <w:rPr>
+      <w:rFonts w:eastAsiaTheme="minorEastAsia" w:cs="Times New Roman"/>
+      <w:kern w:val="0"/>
+      <w:sz w:val="22"/>
+      <w:szCs w:val="22"/>
+      <w:lang w:val="es-ES" w:eastAsia="es-ES"/>
+      <w14:ligatures w14:val="none"/>
+    </w:rPr>
+  </w:style>
+  <w:style w:type="paragraph" w:styleId="Textonotapie">
+    <w:name w:val="footnote text"/>
+    <w:basedOn w:val="Normal"/>
+    <w:link w:val="TextonotapieCar"/>
+    <w:uiPriority w:val="99"/>
+    <w:unhideWhenUsed/>
+    <w:rsid w:val="0058684D"/>
+    <w:pPr>
+      <w:spacing w:after="0" w:line="240" w:lineRule="auto"/>
+    </w:pPr>
+    <w:rPr>
+      <w:rFonts w:eastAsiaTheme="minorEastAsia" w:cs="Times New Roman"/>
+      <w:kern w:val="0"/>
+      <w:sz w:val="20"/>
+      <w:szCs w:val="20"/>
+      <w:lang w:val="es-ES" w:eastAsia="es-ES"/>
+      <w14:ligatures w14:val="none"/>
+    </w:rPr>
+  </w:style>
+  <w:style w:type="character" w:customStyle="1" w:styleId="TextonotapieCar">
+    <w:name w:val="Texto nota pie Car"/>
+    <w:basedOn w:val="Fuentedeprrafopredeter"/>
+    <w:link w:val="Textonotapie"/>
+    <w:uiPriority w:val="99"/>
+    <w:rsid w:val="0058684D"/>
+    <w:rPr>
+      <w:rFonts w:eastAsiaTheme="minorEastAsia" w:cs="Times New Roman"/>
+      <w:kern w:val="0"/>
+      <w:sz w:val="20"/>
+      <w:szCs w:val="20"/>
+      <w:lang w:val="es-ES" w:eastAsia="es-ES"/>
+      <w14:ligatures w14:val="none"/>
+    </w:rPr>
+  </w:style>
+  <w:style w:type="character" w:styleId="nfasissutil">
+    <w:name w:val="Subtle Emphasis"/>
+    <w:basedOn w:val="Fuentedeprrafopredeter"/>
+    <w:uiPriority w:val="19"/>
+    <w:qFormat/>
+    <w:rsid w:val="0058684D"/>
+    <w:rPr>
+      <w:i/>
+      <w:iCs/>
+    </w:rPr>
+  </w:style>
+  <w:style w:type="table" w:styleId="Sombreadoclaro-nfasis1">
+    <w:name w:val="Light Shading Accent 1"/>
+    <w:basedOn w:val="Tablanormal"/>
+    <w:uiPriority w:val="60"/>
+    <w:rsid w:val="0058684D"/>
+    <w:pPr>
+      <w:spacing w:after="0" w:line="240" w:lineRule="auto"/>
+    </w:pPr>
+    <w:rPr>
+      <w:rFonts w:eastAsiaTheme="minorEastAsia"/>
+      <w:color w:val="0F4761" w:themeColor="accent1" w:themeShade="BF"/>
+      <w:kern w:val="0"/>
+      <w:sz w:val="22"/>
+      <w:szCs w:val="22"/>
+      <w:lang w:val="es-ES" w:eastAsia="es-ES"/>
+      <w14:ligatures w14:val="none"/>
+    </w:rPr>
+    <w:tblPr>
+      <w:tblStyleRowBandSize w:val="1"/>
+      <w:tblStyleColBandSize w:val="1"/>
+      <w:tblBorders>
+        <w:top w:val="single" w:sz="8" w:space="0" w:color="156082" w:themeColor="accent1"/>
+        <w:bottom w:val="single" w:sz="8" w:space="0" w:color="156082" w:themeColor="accent1"/>
+      </w:tblBorders>
+    </w:tblPr>
+    <w:tblStylePr w:type="firstRow">
+      <w:pPr>
+        <w:spacing w:before="0" w:after="0" w:line="240" w:lineRule="auto"/>
+      </w:pPr>
+      <w:rPr>
+        <w:b/>
+        <w:bCs/>
+      </w:rPr>
+      <w:tblPr/>
+      <w:tcPr>
+        <w:tcBorders>
+          <w:top w:val="single" w:sz="8" w:space="0" w:color="156082" w:themeColor="accent1"/>
+          <w:left w:val="nil"/>
+          <w:bottom w:val="single" w:sz="8" w:space="0" w:color="156082" w:themeColor="accent1"/>
+          <w:right w:val="nil"/>
+          <w:insideH w:val="nil"/>
+          <w:insideV w:val="nil"/>
+        </w:tcBorders>
+      </w:tcPr>
+    </w:tblStylePr>
+    <w:tblStylePr w:type="lastRow">
+      <w:pPr>
+        <w:spacing w:before="0" w:after="0" w:line="240" w:lineRule="auto"/>
+      </w:pPr>
+      <w:rPr>
+        <w:b/>
+        <w:bCs/>
+      </w:rPr>
+      <w:tblPr/>
+      <w:tcPr>
+        <w:tcBorders>
+          <w:top w:val="single" w:sz="8" w:space="0" w:color="156082" w:themeColor="accent1"/>
+          <w:left w:val="nil"/>
+          <w:bottom w:val="single" w:sz="8" w:space="0" w:color="156082" w:themeColor="accent1"/>
+          <w:right w:val="nil"/>
+          <w:insideH w:val="nil"/>
+          <w:insideV w:val="nil"/>
+        </w:tcBorders>
+      </w:tcPr>
+    </w:tblStylePr>
+    <w:tblStylePr w:type="firstCol">
+      <w:rPr>
+        <w:b/>
+        <w:bCs/>
+      </w:rPr>
+    </w:tblStylePr>
+    <w:tblStylePr w:type="lastCol">
+      <w:rPr>
+        <w:b/>
+        <w:bCs/>
+      </w:rPr>
+    </w:tblStylePr>
+    <w:tblStylePr w:type="band1Vert">
+      <w:tblPr/>
+      <w:tcPr>
+        <w:tcBorders>
+          <w:left w:val="nil"/>
+          <w:right w:val="nil"/>
+          <w:insideH w:val="nil"/>
+          <w:insideV w:val="nil"/>
+        </w:tcBorders>
+        <w:shd w:val="clear" w:color="auto" w:fill="B2DEF2" w:themeFill="accent1" w:themeFillTint="3F"/>
+      </w:tcPr>
+    </w:tblStylePr>
+    <w:tblStylePr w:type="band1Horz">
+      <w:tblPr/>
+      <w:tcPr>
+        <w:tcBorders>
+          <w:left w:val="nil"/>
+          <w:right w:val="nil"/>
+          <w:insideH w:val="nil"/>
+          <w:insideV w:val="nil"/>
+        </w:tcBorders>
+        <w:shd w:val="clear" w:color="auto" w:fill="B2DEF2" w:themeFill="accent1" w:themeFillTint="3F"/>
+      </w:tcPr>
+    </w:tblStylePr>
+  </w:style>
 </w:styles>
 </file>
 

</xml_diff>